<commit_message>
Completa Actividad 3.3 y cierra Tema 3: arquitectura real de Escaparate, CORS explicado y validado en vivo
Sincroniza los recursos de la 3.3 con el frontend real de Escaparate (sustituye restos
de un escenario antiguo de "reseñas"), reescribe la plantilla/solución docx acorde,
y valida la actividad completa en vivo contra el Learner Lab con correcciones puntuales
(consola en vez de CLI para reanudar recursos, casos de contraseña autoadministrada).

Amplía la teoría de "Primera arquitectura completa" con un apartado propio de CORS:
comparación de orígenes, por qué existe la restricción (ejemplo del banco), y un
diagrama de secuencia de cuándo se aplica el bloqueo, tras iterar varias veces para
que quede entendible sin conocimientos previos de desarrollo web.
</commit_message>
<xml_diff>
--- a/docs/tema3/plantillas/Actividad_3_3_INU_Plantilla.docx
+++ b/docs/tema3/plantillas/Actividad_3_3_INU_Plantilla.docx
@@ -167,7 +167,7 @@
                 <w:sz w:val="20"/>
                 <w:szCs w:val="20"/>
               </w:rPr>
-              <w:t xml:space="preserve">Identificador de recursos usado (ej. resenas-db-&lt;tu-identificador&gt;): _______________________</w:t>
+              <w:t xml:space="preserve">Identificador de recursos usado (ej. escaparate-front-&lt;tu-identificador&gt;): _______________________</w:t>
             </w:r>
           </w:p>
         </w:tc>
@@ -198,7 +198,7 @@
           <w:sz w:val="26"/>
           <w:szCs w:val="26"/>
         </w:rPr>
-        <w:t xml:space="preserve">Parte A — Despliega la arquitectura completa</w:t>
+        <w:t xml:space="preserve">Parte A — Separa las capas y déjalas hablando entre sí</w:t>
       </w:r>
     </w:p>
     <w:p>
@@ -222,7 +222,7 @@
           <w:sz w:val="24"/>
           <w:szCs w:val="24"/>
         </w:rPr>
-        <w:t xml:space="preserve">Paso 1 — Crea la base de datos de reseñas</w:t>
+        <w:t xml:space="preserve">Paso 1 — Crea el bucket S3 para el frontend</w:t>
       </w:r>
     </w:p>
     <w:tbl>
@@ -268,7 +268,7 @@
                 <w:sz w:val="20"/>
                 <w:szCs w:val="20"/>
               </w:rPr>
-              <w:t xml:space="preserve">📸 Instancia RDS en estado available, con su endpoint visible</w:t>
+              <w:t xml:space="preserve">📸 Alojamiento de sitio web estático con la URL del endpoint visible, y política de bucket mostrando el ARN de tu propio bucket</w:t>
             </w:r>
           </w:p>
         </w:tc>
@@ -334,7 +334,7 @@
           <w:sz w:val="24"/>
           <w:szCs w:val="24"/>
         </w:rPr>
-        <w:t xml:space="preserve">Paso 2 — Lanza el backend conectado a la base de datos</w:t>
+        <w:t xml:space="preserve">Paso 2 — Autoriza ese origen en el backend con CORS</w:t>
       </w:r>
     </w:p>
     <w:tbl>
@@ -380,7 +380,7 @@
                 <w:sz w:val="20"/>
                 <w:szCs w:val="20"/>
               </w:rPr>
-              <w:t xml:space="preserve">📸 Salida de los logs de arranque mostrando la conexión correcta a RDS</w:t>
+              <w:t xml:space="preserve">📸 Salida del export APP_CORS_ALLOWED_ORIGINS=... con el valor real usado, y la respuesta de /api/salud/listo</w:t>
             </w:r>
           </w:p>
         </w:tc>
@@ -451,7 +451,7 @@
           <w:sz w:val="24"/>
           <w:szCs w:val="24"/>
         </w:rPr>
-        <w:t xml:space="preserve">Paso 3 — Publica el front estático apuntando al backend</w:t>
+        <w:t xml:space="preserve">Paso 4 — Publica el frontend en tu bucket</w:t>
       </w:r>
     </w:p>
     <w:tbl>
@@ -497,7 +497,7 @@
                 <w:sz w:val="20"/>
                 <w:szCs w:val="20"/>
               </w:rPr>
-              <w:t xml:space="preserve">📸 La aplicación de reseñas funcionando de principio a fin, con datos reales</w:t>
+              <w:t xml:space="preserve">📸 Tu frontend cargando en el navegador, con la barra de direcciones visible, mostrando el catálogo con productos</w:t>
             </w:r>
           </w:p>
         </w:tc>
@@ -563,21 +563,7 @@
           <w:sz w:val="24"/>
           <w:szCs w:val="24"/>
         </w:rPr>
-        <w:t xml:space="preserve">Reflexiona</w:t>
-      </w:r>
-    </w:p>
-    <w:p>
-      <w:pPr>
-        <w:spacing w:after="100"/>
-      </w:pPr>
-      <w:r>
-        <w:rPr>
-          <w:rFonts w:ascii="Arial" w:cs="Arial" w:eastAsia="Arial" w:hAnsi="Arial"/>
-          <w:color w:val="212121"/>
-          <w:sz w:val="22"/>
-          <w:szCs w:val="22"/>
-        </w:rPr>
-        <w:t xml:space="preserve">El front en S3 y el backend en EC2 son dos orígenes distintos para el navegador — por eso ha hecho falta habilitar CORS en el backend. ¿Qué error verías en la consola del navegador si no lo hubieras habilitado, y por qué ese error no tiene nada que ver con que la base de datos esté mal configurada?</w:t>
+        <w:t xml:space="preserve">Paso 5 — Comprueba CORS de verdad</w:t>
       </w:r>
     </w:p>
     <w:tbl>
@@ -596,8 +582,41 @@
         <w:gridCol w:w="9638"/>
       </w:tblGrid>
       <w:tr>
+        <w:tc>
+          <w:tcPr>
+            <w:tcW w:type="dxa" w:w="9638"/>
+            <w:tcBorders>
+              <w:top w:val="none" w:color="FFFFFF" w:sz="0"/>
+              <w:left w:val="none" w:color="FFFFFF" w:sz="0"/>
+              <w:bottom w:val="none" w:color="FFFFFF" w:sz="0"/>
+              <w:right w:val="none" w:color="FFFFFF" w:sz="0"/>
+            </w:tcBorders>
+            <w:shd w:fill="3949AB" w:val="clear"/>
+            <w:tcMar>
+              <w:top w:type="dxa" w:w="80"/>
+              <w:left w:type="dxa" w:w="160"/>
+              <w:bottom w:type="dxa" w:w="80"/>
+              <w:right w:type="dxa" w:w="160"/>
+            </w:tcMar>
+          </w:tcPr>
+          <w:p>
+            <w:r>
+              <w:rPr>
+                <w:rFonts w:ascii="Arial" w:cs="Arial" w:eastAsia="Arial" w:hAnsi="Arial"/>
+                <w:b/>
+                <w:bCs/>
+                <w:color w:val="FFFFFF"/>
+                <w:sz w:val="20"/>
+                <w:szCs w:val="20"/>
+              </w:rPr>
+              <w:t xml:space="preserve">📸 Error de CORS en la consola con el origen incorrecto, y la consola limpia una vez restablecido el origen correcto</w:t>
+            </w:r>
+          </w:p>
+        </w:tc>
+      </w:tr>
+      <w:tr>
         <w:trPr>
-          <w:trHeight w:val="480"/>
+          <w:trHeight w:val="2400"/>
         </w:trPr>
         <w:tc>
           <w:tcPr>
@@ -610,115 +629,26 @@
             </w:tcBorders>
             <w:shd w:fill="FAFAFA" w:val="clear"/>
             <w:tcMar>
-              <w:top w:type="dxa" w:w="60"/>
+              <w:top w:type="dxa" w:w="80"/>
               <w:left w:type="dxa" w:w="160"/>
-              <w:bottom w:type="dxa" w:w="60"/>
+              <w:bottom w:type="dxa" w:w="80"/>
               <w:right w:type="dxa" w:w="160"/>
             </w:tcMar>
           </w:tcPr>
           <w:p>
-            <w:r>
-              <w:rPr>
-                <w:sz w:val="22"/>
-                <w:szCs w:val="22"/>
-              </w:rPr>
-              <w:t xml:space="preserve"/>
-            </w:r>
-          </w:p>
-        </w:tc>
-      </w:tr>
-      <w:tr>
-        <w:trPr>
-          <w:trHeight w:val="480"/>
-        </w:trPr>
-        <w:tc>
-          <w:tcPr>
-            <w:tcW w:type="dxa" w:w="9638"/>
-            <w:tcBorders>
-              <w:top w:val="single" w:color="E0E0E0" w:sz="4"/>
-              <w:left w:val="single" w:color="E0E0E0" w:sz="4"/>
-              <w:bottom w:val="single" w:color="E0E0E0" w:sz="4"/>
-              <w:right w:val="single" w:color="E0E0E0" w:sz="4"/>
-            </w:tcBorders>
-            <w:shd w:fill="FAFAFA" w:val="clear"/>
-            <w:tcMar>
-              <w:top w:type="dxa" w:w="60"/>
-              <w:left w:type="dxa" w:w="160"/>
-              <w:bottom w:type="dxa" w:w="60"/>
-              <w:right w:type="dxa" w:w="160"/>
-            </w:tcMar>
-          </w:tcPr>
-          <w:p>
-            <w:r>
-              <w:rPr>
-                <w:sz w:val="22"/>
-                <w:szCs w:val="22"/>
-              </w:rPr>
-              <w:t xml:space="preserve"/>
-            </w:r>
-          </w:p>
-        </w:tc>
-      </w:tr>
-      <w:tr>
-        <w:trPr>
-          <w:trHeight w:val="480"/>
-        </w:trPr>
-        <w:tc>
-          <w:tcPr>
-            <w:tcW w:type="dxa" w:w="9638"/>
-            <w:tcBorders>
-              <w:top w:val="single" w:color="E0E0E0" w:sz="4"/>
-              <w:left w:val="single" w:color="E0E0E0" w:sz="4"/>
-              <w:bottom w:val="single" w:color="E0E0E0" w:sz="4"/>
-              <w:right w:val="single" w:color="E0E0E0" w:sz="4"/>
-            </w:tcBorders>
-            <w:shd w:fill="FAFAFA" w:val="clear"/>
-            <w:tcMar>
-              <w:top w:type="dxa" w:w="60"/>
-              <w:left w:type="dxa" w:w="160"/>
-              <w:bottom w:type="dxa" w:w="60"/>
-              <w:right w:type="dxa" w:w="160"/>
-            </w:tcMar>
-          </w:tcPr>
-          <w:p>
-            <w:r>
-              <w:rPr>
-                <w:sz w:val="22"/>
-                <w:szCs w:val="22"/>
-              </w:rPr>
-              <w:t xml:space="preserve"/>
-            </w:r>
-          </w:p>
-        </w:tc>
-      </w:tr>
-      <w:tr>
-        <w:trPr>
-          <w:trHeight w:val="480"/>
-        </w:trPr>
-        <w:tc>
-          <w:tcPr>
-            <w:tcW w:type="dxa" w:w="9638"/>
-            <w:tcBorders>
-              <w:top w:val="single" w:color="E0E0E0" w:sz="4"/>
-              <w:left w:val="single" w:color="E0E0E0" w:sz="4"/>
-              <w:bottom w:val="single" w:color="E0E0E0" w:sz="4"/>
-              <w:right w:val="single" w:color="E0E0E0" w:sz="4"/>
-            </w:tcBorders>
-            <w:shd w:fill="FAFAFA" w:val="clear"/>
-            <w:tcMar>
-              <w:top w:type="dxa" w:w="60"/>
-              <w:left w:type="dxa" w:w="160"/>
-              <w:bottom w:type="dxa" w:w="60"/>
-              <w:right w:type="dxa" w:w="160"/>
-            </w:tcMar>
-          </w:tcPr>
-          <w:p>
-            <w:r>
-              <w:rPr>
-                <w:sz w:val="22"/>
-                <w:szCs w:val="22"/>
-              </w:rPr>
-              <w:t xml:space="preserve"/>
+            <w:pPr>
+              <w:jc w:val="center"/>
+            </w:pPr>
+            <w:r>
+              <w:rPr>
+                <w:rFonts w:ascii="Arial" w:cs="Arial" w:eastAsia="Arial" w:hAnsi="Arial"/>
+                <w:i/>
+                <w:iCs/>
+                <w:color w:val="757575"/>
+                <w:sz w:val="20"/>
+                <w:szCs w:val="20"/>
+              </w:rPr>
+              <w:t xml:space="preserve">[Pega aquí la captura de pantalla]</w:t>
             </w:r>
           </w:p>
         </w:tc>
@@ -726,55 +656,8 @@
     </w:tbl>
     <w:p>
       <w:pPr>
-        <w:spacing w:after="200"/>
-      </w:pPr>
-    </w:p>
-    <w:p>
-      <w:r>
-        <w:br w:type="page"/>
-      </w:r>
-    </w:p>
-    <w:p>
-      <w:pPr>
-        <w:shd w:fill="3949AB" w:val="clear"/>
-        <w:spacing w:after="0" w:before="320"/>
-        <w:ind w:left="200" w:right="200"/>
-      </w:pPr>
-      <w:r>
-        <w:rPr>
-          <w:rFonts w:ascii="Arial" w:cs="Arial" w:eastAsia="Arial" w:hAnsi="Arial"/>
-          <w:b/>
-          <w:bCs/>
-          <w:color w:val="FFFFFF"/>
-          <w:sz w:val="26"/>
-          <w:szCs w:val="26"/>
-        </w:rPr>
-        <w:t xml:space="preserve">Parte B — Reto: documenta la arquitectura de verdad</w:t>
-      </w:r>
-    </w:p>
-    <w:p>
-      <w:pPr>
         <w:spacing w:after="120"/>
       </w:pPr>
-    </w:p>
-    <w:p>
-      <w:pPr>
-        <w:pBdr>
-          <w:bottom w:val="single" w:color="FFA000" w:sz="4" w:space="1"/>
-        </w:pBdr>
-        <w:spacing w:after="120" w:before="240"/>
-      </w:pPr>
-      <w:r>
-        <w:rPr>
-          <w:rFonts w:ascii="Arial" w:cs="Arial" w:eastAsia="Arial" w:hAnsi="Arial"/>
-          <w:b/>
-          <w:bCs/>
-          <w:color w:val="3949AB"/>
-          <w:sz w:val="24"/>
-          <w:szCs w:val="24"/>
-        </w:rPr>
-        <w:t xml:space="preserve">El diagrama</w:t>
-      </w:r>
     </w:p>
     <w:p>
       <w:pPr>
@@ -787,7 +670,7 @@
           <w:sz w:val="22"/>
           <w:szCs w:val="22"/>
         </w:rPr>
-        <w:t xml:space="preserve">Arquitectura completa tal como existe de verdad en tu cuenta — las tres capas, todas las subredes, qué habla con qué.</w:t>
+        <w:t xml:space="preserve">Reflexiona: el backend procesó la petición igual de bien con el origen correcto y con el incorrecto. ¿Dónde se toma exactamente la decisión de bloquear la respuesta: en el servidor, en el navegador, o en algún punto intermedio? ¿Protege CORS los datos de alguien que llame a tu API directamente con curl, sin pasar por un navegador?</w:t>
       </w:r>
     </w:p>
     <w:tbl>
@@ -806,41 +689,40 @@
         <w:gridCol w:w="9638"/>
       </w:tblGrid>
       <w:tr>
+        <w:trPr>
+          <w:trHeight w:val="480"/>
+        </w:trPr>
         <w:tc>
           <w:tcPr>
             <w:tcW w:type="dxa" w:w="9638"/>
             <w:tcBorders>
-              <w:top w:val="none" w:color="FFFFFF" w:sz="0"/>
-              <w:left w:val="none" w:color="FFFFFF" w:sz="0"/>
-              <w:bottom w:val="none" w:color="FFFFFF" w:sz="0"/>
-              <w:right w:val="none" w:color="FFFFFF" w:sz="0"/>
-            </w:tcBorders>
-            <w:shd w:fill="3949AB" w:val="clear"/>
-            <w:tcMar>
-              <w:top w:type="dxa" w:w="80"/>
+              <w:top w:val="single" w:color="E0E0E0" w:sz="4"/>
+              <w:left w:val="single" w:color="E0E0E0" w:sz="4"/>
+              <w:bottom w:val="single" w:color="E0E0E0" w:sz="4"/>
+              <w:right w:val="single" w:color="E0E0E0" w:sz="4"/>
+            </w:tcBorders>
+            <w:shd w:fill="FAFAFA" w:val="clear"/>
+            <w:tcMar>
+              <w:top w:type="dxa" w:w="60"/>
               <w:left w:type="dxa" w:w="160"/>
-              <w:bottom w:type="dxa" w:w="80"/>
+              <w:bottom w:type="dxa" w:w="60"/>
               <w:right w:type="dxa" w:w="160"/>
             </w:tcMar>
           </w:tcPr>
           <w:p>
             <w:r>
               <w:rPr>
-                <w:rFonts w:ascii="Arial" w:cs="Arial" w:eastAsia="Arial" w:hAnsi="Arial"/>
-                <w:b/>
-                <w:bCs/>
-                <w:color w:val="FFFFFF"/>
-                <w:sz w:val="20"/>
-                <w:szCs w:val="20"/>
-              </w:rPr>
-              <w:t xml:space="preserve">📸 Diagrama completo de la arquitectura</w:t>
+                <w:sz w:val="22"/>
+                <w:szCs w:val="22"/>
+              </w:rPr>
+              <w:t xml:space="preserve"/>
             </w:r>
           </w:p>
         </w:tc>
       </w:tr>
       <w:tr>
         <w:trPr>
-          <w:trHeight w:val="2400"/>
+          <w:trHeight w:val="480"/>
         </w:trPr>
         <w:tc>
           <w:tcPr>
@@ -853,26 +735,83 @@
             </w:tcBorders>
             <w:shd w:fill="FAFAFA" w:val="clear"/>
             <w:tcMar>
-              <w:top w:type="dxa" w:w="80"/>
+              <w:top w:type="dxa" w:w="60"/>
               <w:left w:type="dxa" w:w="160"/>
-              <w:bottom w:type="dxa" w:w="80"/>
+              <w:bottom w:type="dxa" w:w="60"/>
               <w:right w:type="dxa" w:w="160"/>
             </w:tcMar>
           </w:tcPr>
           <w:p>
-            <w:pPr>
-              <w:jc w:val="center"/>
-            </w:pPr>
-            <w:r>
-              <w:rPr>
-                <w:rFonts w:ascii="Arial" w:cs="Arial" w:eastAsia="Arial" w:hAnsi="Arial"/>
-                <w:i/>
-                <w:iCs/>
-                <w:color w:val="757575"/>
-                <w:sz w:val="20"/>
-                <w:szCs w:val="20"/>
-              </w:rPr>
-              <w:t xml:space="preserve">[Pega aquí la captura de pantalla]</w:t>
+            <w:r>
+              <w:rPr>
+                <w:sz w:val="22"/>
+                <w:szCs w:val="22"/>
+              </w:rPr>
+              <w:t xml:space="preserve"/>
+            </w:r>
+          </w:p>
+        </w:tc>
+      </w:tr>
+      <w:tr>
+        <w:trPr>
+          <w:trHeight w:val="480"/>
+        </w:trPr>
+        <w:tc>
+          <w:tcPr>
+            <w:tcW w:type="dxa" w:w="9638"/>
+            <w:tcBorders>
+              <w:top w:val="single" w:color="E0E0E0" w:sz="4"/>
+              <w:left w:val="single" w:color="E0E0E0" w:sz="4"/>
+              <w:bottom w:val="single" w:color="E0E0E0" w:sz="4"/>
+              <w:right w:val="single" w:color="E0E0E0" w:sz="4"/>
+            </w:tcBorders>
+            <w:shd w:fill="FAFAFA" w:val="clear"/>
+            <w:tcMar>
+              <w:top w:type="dxa" w:w="60"/>
+              <w:left w:type="dxa" w:w="160"/>
+              <w:bottom w:type="dxa" w:w="60"/>
+              <w:right w:type="dxa" w:w="160"/>
+            </w:tcMar>
+          </w:tcPr>
+          <w:p>
+            <w:r>
+              <w:rPr>
+                <w:sz w:val="22"/>
+                <w:szCs w:val="22"/>
+              </w:rPr>
+              <w:t xml:space="preserve"/>
+            </w:r>
+          </w:p>
+        </w:tc>
+      </w:tr>
+      <w:tr>
+        <w:trPr>
+          <w:trHeight w:val="480"/>
+        </w:trPr>
+        <w:tc>
+          <w:tcPr>
+            <w:tcW w:type="dxa" w:w="9638"/>
+            <w:tcBorders>
+              <w:top w:val="single" w:color="E0E0E0" w:sz="4"/>
+              <w:left w:val="single" w:color="E0E0E0" w:sz="4"/>
+              <w:bottom w:val="single" w:color="E0E0E0" w:sz="4"/>
+              <w:right w:val="single" w:color="E0E0E0" w:sz="4"/>
+            </w:tcBorders>
+            <w:shd w:fill="FAFAFA" w:val="clear"/>
+            <w:tcMar>
+              <w:top w:type="dxa" w:w="60"/>
+              <w:left w:type="dxa" w:w="160"/>
+              <w:bottom w:type="dxa" w:w="60"/>
+              <w:right w:type="dxa" w:w="160"/>
+            </w:tcMar>
+          </w:tcPr>
+          <w:p>
+            <w:r>
+              <w:rPr>
+                <w:sz w:val="22"/>
+                <w:szCs w:val="22"/>
+              </w:rPr>
+              <w:t xml:space="preserve"/>
             </w:r>
           </w:p>
         </w:tc>
@@ -880,8 +819,13 @@
     </w:tbl>
     <w:p>
       <w:pPr>
-        <w:spacing w:after="160"/>
-      </w:pPr>
+        <w:spacing w:after="200"/>
+      </w:pPr>
+    </w:p>
+    <w:p>
+      <w:r>
+        <w:br w:type="page"/>
+      </w:r>
     </w:p>
     <w:p>
       <w:pPr>
@@ -899,21 +843,529 @@
           <w:sz w:val="24"/>
           <w:szCs w:val="24"/>
         </w:rPr>
-        <w:t xml:space="preserve">El coste</w:t>
-      </w:r>
-    </w:p>
-    <w:p>
-      <w:pPr>
-        <w:spacing w:after="100"/>
+        <w:t xml:space="preserve">Paso 6 — Identifica los puntos únicos de fallo de tu propio despliegue</w:t>
+      </w:r>
+    </w:p>
+    <w:tbl>
+      <w:tblPr>
+        <w:tblW w:type="dxa" w:w="9638"/>
+        <w:tblBorders>
+          <w:top w:val="single" w:color="auto" w:sz="4"/>
+          <w:left w:val="single" w:color="auto" w:sz="4"/>
+          <w:bottom w:val="single" w:color="auto" w:sz="4"/>
+          <w:right w:val="single" w:color="auto" w:sz="4"/>
+          <w:insideH w:val="single" w:color="auto" w:sz="4"/>
+          <w:insideV w:val="single" w:color="auto" w:sz="4"/>
+        </w:tblBorders>
+      </w:tblPr>
+      <w:tblGrid>
+        <w:gridCol w:w="2699"/>
+        <w:gridCol w:w="1735"/>
+        <w:gridCol w:w="5205"/>
+      </w:tblGrid>
+      <w:tr>
+        <w:tc>
+          <w:tcPr>
+            <w:tcW w:type="dxa" w:w="2699"/>
+            <w:tcBorders>
+              <w:top w:val="single" w:color="E0E0E0" w:sz="4"/>
+              <w:left w:val="single" w:color="E0E0E0" w:sz="4"/>
+              <w:bottom w:val="single" w:color="E0E0E0" w:sz="4"/>
+              <w:right w:val="single" w:color="E0E0E0" w:sz="4"/>
+            </w:tcBorders>
+            <w:shd w:fill="3949AB" w:val="clear"/>
+            <w:tcMar>
+              <w:top w:type="dxa" w:w="100"/>
+              <w:left w:type="dxa" w:w="140"/>
+              <w:bottom w:type="dxa" w:w="100"/>
+              <w:right w:type="dxa" w:w="100"/>
+            </w:tcMar>
+          </w:tcPr>
+          <w:p>
+            <w:pPr>
+              <w:jc w:val="center"/>
+            </w:pPr>
+            <w:r>
+              <w:rPr>
+                <w:rFonts w:ascii="Arial" w:cs="Arial" w:eastAsia="Arial" w:hAnsi="Arial"/>
+                <w:b/>
+                <w:bCs/>
+                <w:color w:val="FFFFFF"/>
+                <w:sz w:val="20"/>
+                <w:szCs w:val="20"/>
+              </w:rPr>
+              <w:t xml:space="preserve">Pieza</w:t>
+            </w:r>
+          </w:p>
+        </w:tc>
+        <w:tc>
+          <w:tcPr>
+            <w:tcW w:type="dxa" w:w="1735"/>
+            <w:tcBorders>
+              <w:top w:val="single" w:color="E0E0E0" w:sz="4"/>
+              <w:left w:val="single" w:color="E0E0E0" w:sz="4"/>
+              <w:bottom w:val="single" w:color="E0E0E0" w:sz="4"/>
+              <w:right w:val="single" w:color="E0E0E0" w:sz="4"/>
+            </w:tcBorders>
+            <w:shd w:fill="3949AB" w:val="clear"/>
+            <w:tcMar>
+              <w:top w:type="dxa" w:w="100"/>
+              <w:left w:type="dxa" w:w="140"/>
+              <w:bottom w:type="dxa" w:w="100"/>
+              <w:right w:type="dxa" w:w="100"/>
+            </w:tcMar>
+          </w:tcPr>
+          <w:p>
+            <w:pPr>
+              <w:jc w:val="center"/>
+            </w:pPr>
+            <w:r>
+              <w:rPr>
+                <w:rFonts w:ascii="Arial" w:cs="Arial" w:eastAsia="Arial" w:hAnsi="Arial"/>
+                <w:b/>
+                <w:bCs/>
+                <w:color w:val="FFFFFF"/>
+                <w:sz w:val="20"/>
+                <w:szCs w:val="20"/>
+              </w:rPr>
+              <w:t xml:space="preserve">¿Es un SPOF hoy?</w:t>
+            </w:r>
+          </w:p>
+        </w:tc>
+        <w:tc>
+          <w:tcPr>
+            <w:tcW w:type="dxa" w:w="5205"/>
+            <w:tcBorders>
+              <w:top w:val="single" w:color="E0E0E0" w:sz="4"/>
+              <w:left w:val="single" w:color="E0E0E0" w:sz="4"/>
+              <w:bottom w:val="single" w:color="E0E0E0" w:sz="4"/>
+              <w:right w:val="single" w:color="E0E0E0" w:sz="4"/>
+            </w:tcBorders>
+            <w:shd w:fill="3949AB" w:val="clear"/>
+            <w:tcMar>
+              <w:top w:type="dxa" w:w="100"/>
+              <w:left w:type="dxa" w:w="140"/>
+              <w:bottom w:type="dxa" w:w="100"/>
+              <w:right w:type="dxa" w:w="100"/>
+            </w:tcMar>
+          </w:tcPr>
+          <w:p>
+            <w:pPr>
+              <w:jc w:val="center"/>
+            </w:pPr>
+            <w:r>
+              <w:rPr>
+                <w:rFonts w:ascii="Arial" w:cs="Arial" w:eastAsia="Arial" w:hAnsi="Arial"/>
+                <w:b/>
+                <w:bCs/>
+                <w:color w:val="FFFFFF"/>
+                <w:sz w:val="20"/>
+                <w:szCs w:val="20"/>
+              </w:rPr>
+              <w:t xml:space="preserve">Por qué</w:t>
+            </w:r>
+          </w:p>
+        </w:tc>
+      </w:tr>
+      <w:tr>
+        <w:trPr>
+          <w:trHeight w:val="700"/>
+        </w:trPr>
+        <w:tc>
+          <w:tcPr>
+            <w:tcW w:type="dxa" w:w="2699"/>
+            <w:tcBorders>
+              <w:top w:val="single" w:color="E0E0E0" w:sz="4"/>
+              <w:left w:val="single" w:color="E0E0E0" w:sz="4"/>
+              <w:bottom w:val="single" w:color="E0E0E0" w:sz="4"/>
+              <w:right w:val="single" w:color="E0E0E0" w:sz="4"/>
+            </w:tcBorders>
+            <w:shd w:fill="FFFFFF" w:val="clear"/>
+            <w:tcMar>
+              <w:top w:type="dxa" w:w="80"/>
+              <w:left w:type="dxa" w:w="140"/>
+              <w:bottom w:type="dxa" w:w="80"/>
+              <w:right w:type="dxa" w:w="100"/>
+            </w:tcMar>
+          </w:tcPr>
+          <w:p>
+            <w:r>
+              <w:rPr>
+                <w:rFonts w:ascii="Arial" w:cs="Arial" w:eastAsia="Arial" w:hAnsi="Arial"/>
+                <w:sz w:val="20"/>
+                <w:szCs w:val="20"/>
+              </w:rPr>
+              <w:t xml:space="preserve">Bucket S3 del frontend</w:t>
+            </w:r>
+          </w:p>
+        </w:tc>
+        <w:tc>
+          <w:tcPr>
+            <w:tcW w:type="dxa" w:w="1735"/>
+            <w:tcBorders>
+              <w:top w:val="single" w:color="E0E0E0" w:sz="4"/>
+              <w:left w:val="single" w:color="E0E0E0" w:sz="4"/>
+              <w:bottom w:val="single" w:color="E0E0E0" w:sz="4"/>
+              <w:right w:val="single" w:color="E0E0E0" w:sz="4"/>
+            </w:tcBorders>
+            <w:shd w:fill="FFFFFF" w:val="clear"/>
+            <w:tcMar>
+              <w:top w:type="dxa" w:w="80"/>
+              <w:left w:type="dxa" w:w="140"/>
+              <w:bottom w:type="dxa" w:w="80"/>
+              <w:right w:type="dxa" w:w="100"/>
+            </w:tcMar>
+          </w:tcPr>
+          <w:p>
+            <w:r>
+              <w:rPr>
+                <w:sz w:val="22"/>
+                <w:szCs w:val="22"/>
+              </w:rPr>
+              <w:t xml:space="preserve"/>
+            </w:r>
+          </w:p>
+        </w:tc>
+        <w:tc>
+          <w:tcPr>
+            <w:tcW w:type="dxa" w:w="5205"/>
+            <w:tcBorders>
+              <w:top w:val="single" w:color="E0E0E0" w:sz="4"/>
+              <w:left w:val="single" w:color="E0E0E0" w:sz="4"/>
+              <w:bottom w:val="single" w:color="E0E0E0" w:sz="4"/>
+              <w:right w:val="single" w:color="E0E0E0" w:sz="4"/>
+            </w:tcBorders>
+            <w:shd w:fill="FFFFFF" w:val="clear"/>
+            <w:tcMar>
+              <w:top w:type="dxa" w:w="80"/>
+              <w:left w:type="dxa" w:w="140"/>
+              <w:bottom w:type="dxa" w:w="80"/>
+              <w:right w:type="dxa" w:w="100"/>
+            </w:tcMar>
+          </w:tcPr>
+          <w:p>
+            <w:r>
+              <w:rPr>
+                <w:sz w:val="22"/>
+                <w:szCs w:val="22"/>
+              </w:rPr>
+              <w:t xml:space="preserve"/>
+            </w:r>
+          </w:p>
+        </w:tc>
+      </w:tr>
+      <w:tr>
+        <w:trPr>
+          <w:trHeight w:val="700"/>
+        </w:trPr>
+        <w:tc>
+          <w:tcPr>
+            <w:tcW w:type="dxa" w:w="2699"/>
+            <w:tcBorders>
+              <w:top w:val="single" w:color="E0E0E0" w:sz="4"/>
+              <w:left w:val="single" w:color="E0E0E0" w:sz="4"/>
+              <w:bottom w:val="single" w:color="E0E0E0" w:sz="4"/>
+              <w:right w:val="single" w:color="E0E0E0" w:sz="4"/>
+            </w:tcBorders>
+            <w:shd w:fill="F5F5F5" w:val="clear"/>
+            <w:tcMar>
+              <w:top w:type="dxa" w:w="80"/>
+              <w:left w:type="dxa" w:w="140"/>
+              <w:bottom w:type="dxa" w:w="80"/>
+              <w:right w:type="dxa" w:w="100"/>
+            </w:tcMar>
+          </w:tcPr>
+          <w:p>
+            <w:r>
+              <w:rPr>
+                <w:rFonts w:ascii="Arial" w:cs="Arial" w:eastAsia="Arial" w:hAnsi="Arial"/>
+                <w:sz w:val="20"/>
+                <w:szCs w:val="20"/>
+              </w:rPr>
+              <w:t xml:space="preserve">Instancia EC2 de Escaparate</w:t>
+            </w:r>
+          </w:p>
+        </w:tc>
+        <w:tc>
+          <w:tcPr>
+            <w:tcW w:type="dxa" w:w="1735"/>
+            <w:tcBorders>
+              <w:top w:val="single" w:color="E0E0E0" w:sz="4"/>
+              <w:left w:val="single" w:color="E0E0E0" w:sz="4"/>
+              <w:bottom w:val="single" w:color="E0E0E0" w:sz="4"/>
+              <w:right w:val="single" w:color="E0E0E0" w:sz="4"/>
+            </w:tcBorders>
+            <w:shd w:fill="F5F5F5" w:val="clear"/>
+            <w:tcMar>
+              <w:top w:type="dxa" w:w="80"/>
+              <w:left w:type="dxa" w:w="140"/>
+              <w:bottom w:type="dxa" w:w="80"/>
+              <w:right w:type="dxa" w:w="100"/>
+            </w:tcMar>
+          </w:tcPr>
+          <w:p>
+            <w:r>
+              <w:rPr>
+                <w:sz w:val="22"/>
+                <w:szCs w:val="22"/>
+              </w:rPr>
+              <w:t xml:space="preserve"/>
+            </w:r>
+          </w:p>
+        </w:tc>
+        <w:tc>
+          <w:tcPr>
+            <w:tcW w:type="dxa" w:w="5205"/>
+            <w:tcBorders>
+              <w:top w:val="single" w:color="E0E0E0" w:sz="4"/>
+              <w:left w:val="single" w:color="E0E0E0" w:sz="4"/>
+              <w:bottom w:val="single" w:color="E0E0E0" w:sz="4"/>
+              <w:right w:val="single" w:color="E0E0E0" w:sz="4"/>
+            </w:tcBorders>
+            <w:shd w:fill="F5F5F5" w:val="clear"/>
+            <w:tcMar>
+              <w:top w:type="dxa" w:w="80"/>
+              <w:left w:type="dxa" w:w="140"/>
+              <w:bottom w:type="dxa" w:w="80"/>
+              <w:right w:type="dxa" w:w="100"/>
+            </w:tcMar>
+          </w:tcPr>
+          <w:p>
+            <w:r>
+              <w:rPr>
+                <w:sz w:val="22"/>
+                <w:szCs w:val="22"/>
+              </w:rPr>
+              <w:t xml:space="preserve"/>
+            </w:r>
+          </w:p>
+        </w:tc>
+      </w:tr>
+      <w:tr>
+        <w:trPr>
+          <w:trHeight w:val="700"/>
+        </w:trPr>
+        <w:tc>
+          <w:tcPr>
+            <w:tcW w:type="dxa" w:w="2699"/>
+            <w:tcBorders>
+              <w:top w:val="single" w:color="E0E0E0" w:sz="4"/>
+              <w:left w:val="single" w:color="E0E0E0" w:sz="4"/>
+              <w:bottom w:val="single" w:color="E0E0E0" w:sz="4"/>
+              <w:right w:val="single" w:color="E0E0E0" w:sz="4"/>
+            </w:tcBorders>
+            <w:shd w:fill="FFFFFF" w:val="clear"/>
+            <w:tcMar>
+              <w:top w:type="dxa" w:w="80"/>
+              <w:left w:type="dxa" w:w="140"/>
+              <w:bottom w:type="dxa" w:w="80"/>
+              <w:right w:type="dxa" w:w="100"/>
+            </w:tcMar>
+          </w:tcPr>
+          <w:p>
+            <w:r>
+              <w:rPr>
+                <w:rFonts w:ascii="Arial" w:cs="Arial" w:eastAsia="Arial" w:hAnsi="Arial"/>
+                <w:sz w:val="20"/>
+                <w:szCs w:val="20"/>
+              </w:rPr>
+              <w:t xml:space="preserve">Instancia RDS</w:t>
+            </w:r>
+          </w:p>
+        </w:tc>
+        <w:tc>
+          <w:tcPr>
+            <w:tcW w:type="dxa" w:w="1735"/>
+            <w:tcBorders>
+              <w:top w:val="single" w:color="E0E0E0" w:sz="4"/>
+              <w:left w:val="single" w:color="E0E0E0" w:sz="4"/>
+              <w:bottom w:val="single" w:color="E0E0E0" w:sz="4"/>
+              <w:right w:val="single" w:color="E0E0E0" w:sz="4"/>
+            </w:tcBorders>
+            <w:shd w:fill="FFFFFF" w:val="clear"/>
+            <w:tcMar>
+              <w:top w:type="dxa" w:w="80"/>
+              <w:left w:type="dxa" w:w="140"/>
+              <w:bottom w:type="dxa" w:w="80"/>
+              <w:right w:type="dxa" w:w="100"/>
+            </w:tcMar>
+          </w:tcPr>
+          <w:p>
+            <w:r>
+              <w:rPr>
+                <w:sz w:val="22"/>
+                <w:szCs w:val="22"/>
+              </w:rPr>
+              <w:t xml:space="preserve"/>
+            </w:r>
+          </w:p>
+        </w:tc>
+        <w:tc>
+          <w:tcPr>
+            <w:tcW w:type="dxa" w:w="5205"/>
+            <w:tcBorders>
+              <w:top w:val="single" w:color="E0E0E0" w:sz="4"/>
+              <w:left w:val="single" w:color="E0E0E0" w:sz="4"/>
+              <w:bottom w:val="single" w:color="E0E0E0" w:sz="4"/>
+              <w:right w:val="single" w:color="E0E0E0" w:sz="4"/>
+            </w:tcBorders>
+            <w:shd w:fill="FFFFFF" w:val="clear"/>
+            <w:tcMar>
+              <w:top w:type="dxa" w:w="80"/>
+              <w:left w:type="dxa" w:w="140"/>
+              <w:bottom w:type="dxa" w:w="80"/>
+              <w:right w:type="dxa" w:w="100"/>
+            </w:tcMar>
+          </w:tcPr>
+          <w:p>
+            <w:r>
+              <w:rPr>
+                <w:sz w:val="22"/>
+                <w:szCs w:val="22"/>
+              </w:rPr>
+              <w:t xml:space="preserve"/>
+            </w:r>
+          </w:p>
+        </w:tc>
+      </w:tr>
+      <w:tr>
+        <w:trPr>
+          <w:trHeight w:val="700"/>
+        </w:trPr>
+        <w:tc>
+          <w:tcPr>
+            <w:tcW w:type="dxa" w:w="2699"/>
+            <w:tcBorders>
+              <w:top w:val="single" w:color="E0E0E0" w:sz="4"/>
+              <w:left w:val="single" w:color="E0E0E0" w:sz="4"/>
+              <w:bottom w:val="single" w:color="E0E0E0" w:sz="4"/>
+              <w:right w:val="single" w:color="E0E0E0" w:sz="4"/>
+            </w:tcBorders>
+            <w:shd w:fill="F5F5F5" w:val="clear"/>
+            <w:tcMar>
+              <w:top w:type="dxa" w:w="80"/>
+              <w:left w:type="dxa" w:w="140"/>
+              <w:bottom w:type="dxa" w:w="80"/>
+              <w:right w:type="dxa" w:w="100"/>
+            </w:tcMar>
+          </w:tcPr>
+          <w:p>
+            <w:r>
+              <w:rPr>
+                <w:rFonts w:ascii="Arial" w:cs="Arial" w:eastAsia="Arial" w:hAnsi="Arial"/>
+                <w:sz w:val="20"/>
+                <w:szCs w:val="20"/>
+              </w:rPr>
+              <w:t xml:space="preserve">Grupo de seguridad de RDS</w:t>
+            </w:r>
+          </w:p>
+        </w:tc>
+        <w:tc>
+          <w:tcPr>
+            <w:tcW w:type="dxa" w:w="1735"/>
+            <w:tcBorders>
+              <w:top w:val="single" w:color="E0E0E0" w:sz="4"/>
+              <w:left w:val="single" w:color="E0E0E0" w:sz="4"/>
+              <w:bottom w:val="single" w:color="E0E0E0" w:sz="4"/>
+              <w:right w:val="single" w:color="E0E0E0" w:sz="4"/>
+            </w:tcBorders>
+            <w:shd w:fill="F5F5F5" w:val="clear"/>
+            <w:tcMar>
+              <w:top w:type="dxa" w:w="80"/>
+              <w:left w:type="dxa" w:w="140"/>
+              <w:bottom w:type="dxa" w:w="80"/>
+              <w:right w:type="dxa" w:w="100"/>
+            </w:tcMar>
+          </w:tcPr>
+          <w:p>
+            <w:r>
+              <w:rPr>
+                <w:sz w:val="22"/>
+                <w:szCs w:val="22"/>
+              </w:rPr>
+              <w:t xml:space="preserve"/>
+            </w:r>
+          </w:p>
+        </w:tc>
+        <w:tc>
+          <w:tcPr>
+            <w:tcW w:type="dxa" w:w="5205"/>
+            <w:tcBorders>
+              <w:top w:val="single" w:color="E0E0E0" w:sz="4"/>
+              <w:left w:val="single" w:color="E0E0E0" w:sz="4"/>
+              <w:bottom w:val="single" w:color="E0E0E0" w:sz="4"/>
+              <w:right w:val="single" w:color="E0E0E0" w:sz="4"/>
+            </w:tcBorders>
+            <w:shd w:fill="F5F5F5" w:val="clear"/>
+            <w:tcMar>
+              <w:top w:type="dxa" w:w="80"/>
+              <w:left w:type="dxa" w:w="140"/>
+              <w:bottom w:type="dxa" w:w="80"/>
+              <w:right w:type="dxa" w:w="100"/>
+            </w:tcMar>
+          </w:tcPr>
+          <w:p>
+            <w:r>
+              <w:rPr>
+                <w:sz w:val="22"/>
+                <w:szCs w:val="22"/>
+              </w:rPr>
+              <w:t xml:space="preserve"/>
+            </w:r>
+          </w:p>
+        </w:tc>
+      </w:tr>
+    </w:tbl>
+    <w:p>
+      <w:pPr>
+        <w:spacing w:after="200"/>
+      </w:pPr>
+    </w:p>
+    <w:p>
+      <w:r>
+        <w:br w:type="page"/>
+      </w:r>
+    </w:p>
+    <w:p>
+      <w:pPr>
+        <w:shd w:fill="3949AB" w:val="clear"/>
+        <w:spacing w:after="0" w:before="320"/>
+        <w:ind w:left="200" w:right="200"/>
       </w:pPr>
       <w:r>
         <w:rPr>
           <w:rFonts w:ascii="Arial" w:cs="Arial" w:eastAsia="Arial" w:hAnsi="Arial"/>
-          <w:color w:val="212121"/>
-          <w:sz w:val="22"/>
-          <w:szCs w:val="22"/>
+          <w:b/>
+          <w:bCs/>
+          <w:color w:val="FFFFFF"/>
+          <w:sz w:val="26"/>
+          <w:szCs w:val="26"/>
         </w:rPr>
-        <w:t xml:space="preserve">Coste mensual real de mantener esta arquitectura funcionando permanentemente, desglosado por servicio (instancia backend, RDS, almacenamiento S3, transferencia).</w:t>
+        <w:t xml:space="preserve">Parte B — Reto: rompe una capa a propósito y documenta el fallo</w:t>
+      </w:r>
+    </w:p>
+    <w:p>
+      <w:pPr>
+        <w:spacing w:after="120"/>
+      </w:pPr>
+    </w:p>
+    <w:p>
+      <w:pPr>
+        <w:pBdr>
+          <w:bottom w:val="single" w:color="FFA000" w:sz="4" w:space="1"/>
+        </w:pBdr>
+        <w:spacing w:after="120" w:before="240"/>
+      </w:pPr>
+      <w:r>
+        <w:rPr>
+          <w:rFonts w:ascii="Arial" w:cs="Arial" w:eastAsia="Arial" w:hAnsi="Arial"/>
+          <w:b/>
+          <w:bCs/>
+          <w:color w:val="3949AB"/>
+          <w:sz w:val="24"/>
+          <w:szCs w:val="24"/>
+        </w:rPr>
+        <w:t xml:space="preserve">Rompe el front sin tocar el backend</w:t>
       </w:r>
     </w:p>
     <w:tbl>
@@ -959,7 +1411,7 @@
                 <w:sz w:val="20"/>
                 <w:szCs w:val="20"/>
               </w:rPr>
-              <w:t xml:space="preserve">📸 Desglose de coste por servicio</w:t>
+              <w:t xml:space="preserve">📸 Comprobación de que la API sigue respondiendo tras borrar index.html, y el front recuperado tras volver a subirlo</w:t>
             </w:r>
           </w:p>
         </w:tc>
@@ -1025,21 +1477,7 @@
           <w:sz w:val="24"/>
           <w:szCs w:val="24"/>
         </w:rPr>
-        <w:t xml:space="preserve">Los puntos únicos de fallo</w:t>
-      </w:r>
-    </w:p>
-    <w:p>
-      <w:pPr>
-        <w:spacing w:after="100"/>
-      </w:pPr>
-      <w:r>
-        <w:rPr>
-          <w:rFonts w:ascii="Arial" w:cs="Arial" w:eastAsia="Arial" w:hAnsi="Arial"/>
-          <w:color w:val="212121"/>
-          <w:sz w:val="22"/>
-          <w:szCs w:val="22"/>
-        </w:rPr>
-        <w:t xml:space="preserve">Para cada punto único de fallo que identifiques en tu diagrama, explica exactamente qué se rompe y por qué esa pieza en concreto no tiene ningún respaldo ahora mismo.</w:t>
+        <w:t xml:space="preserve">Rompe el backend sin tocar el front</w:t>
       </w:r>
     </w:p>
     <w:tbl>
@@ -1058,8 +1496,41 @@
         <w:gridCol w:w="9638"/>
       </w:tblGrid>
       <w:tr>
+        <w:tc>
+          <w:tcPr>
+            <w:tcW w:type="dxa" w:w="9638"/>
+            <w:tcBorders>
+              <w:top w:val="none" w:color="FFFFFF" w:sz="0"/>
+              <w:left w:val="none" w:color="FFFFFF" w:sz="0"/>
+              <w:bottom w:val="none" w:color="FFFFFF" w:sz="0"/>
+              <w:right w:val="none" w:color="FFFFFF" w:sz="0"/>
+            </w:tcBorders>
+            <w:shd w:fill="3949AB" w:val="clear"/>
+            <w:tcMar>
+              <w:top w:type="dxa" w:w="80"/>
+              <w:left w:type="dxa" w:w="160"/>
+              <w:bottom w:type="dxa" w:w="80"/>
+              <w:right w:type="dxa" w:w="160"/>
+            </w:tcMar>
+          </w:tcPr>
+          <w:p>
+            <w:r>
+              <w:rPr>
+                <w:rFonts w:ascii="Arial" w:cs="Arial" w:eastAsia="Arial" w:hAnsi="Arial"/>
+                <w:b/>
+                <w:bCs/>
+                <w:color w:val="FFFFFF"/>
+                <w:sz w:val="20"/>
+                <w:szCs w:val="20"/>
+              </w:rPr>
+              <w:t xml:space="preserve">📸 Error exacto observado en la consola del navegador al parar Escaparate, y la recuperación tras volver a arrancarlo</w:t>
+            </w:r>
+          </w:p>
+        </w:tc>
+      </w:tr>
+      <w:tr>
         <w:trPr>
-          <w:trHeight w:val="480"/>
+          <w:trHeight w:val="2400"/>
         </w:trPr>
         <w:tc>
           <w:tcPr>
@@ -1072,55 +1543,84 @@
             </w:tcBorders>
             <w:shd w:fill="FAFAFA" w:val="clear"/>
             <w:tcMar>
-              <w:top w:type="dxa" w:w="60"/>
+              <w:top w:type="dxa" w:w="80"/>
               <w:left w:type="dxa" w:w="160"/>
-              <w:bottom w:type="dxa" w:w="60"/>
+              <w:bottom w:type="dxa" w:w="80"/>
               <w:right w:type="dxa" w:w="160"/>
             </w:tcMar>
           </w:tcPr>
           <w:p>
-            <w:r>
-              <w:rPr>
-                <w:sz w:val="22"/>
-                <w:szCs w:val="22"/>
-              </w:rPr>
-              <w:t xml:space="preserve"/>
-            </w:r>
-          </w:p>
-        </w:tc>
-      </w:tr>
-      <w:tr>
-        <w:trPr>
-          <w:trHeight w:val="480"/>
-        </w:trPr>
-        <w:tc>
-          <w:tcPr>
-            <w:tcW w:type="dxa" w:w="9638"/>
-            <w:tcBorders>
-              <w:top w:val="single" w:color="E0E0E0" w:sz="4"/>
-              <w:left w:val="single" w:color="E0E0E0" w:sz="4"/>
-              <w:bottom w:val="single" w:color="E0E0E0" w:sz="4"/>
-              <w:right w:val="single" w:color="E0E0E0" w:sz="4"/>
-            </w:tcBorders>
-            <w:shd w:fill="FAFAFA" w:val="clear"/>
-            <w:tcMar>
-              <w:top w:type="dxa" w:w="60"/>
-              <w:left w:type="dxa" w:w="160"/>
-              <w:bottom w:type="dxa" w:w="60"/>
-              <w:right w:type="dxa" w:w="160"/>
-            </w:tcMar>
-          </w:tcPr>
-          <w:p>
-            <w:r>
-              <w:rPr>
-                <w:sz w:val="22"/>
-                <w:szCs w:val="22"/>
-              </w:rPr>
-              <w:t xml:space="preserve"/>
-            </w:r>
-          </w:p>
-        </w:tc>
-      </w:tr>
+            <w:pPr>
+              <w:jc w:val="center"/>
+            </w:pPr>
+            <w:r>
+              <w:rPr>
+                <w:rFonts w:ascii="Arial" w:cs="Arial" w:eastAsia="Arial" w:hAnsi="Arial"/>
+                <w:i/>
+                <w:iCs/>
+                <w:color w:val="757575"/>
+                <w:sz w:val="20"/>
+                <w:szCs w:val="20"/>
+              </w:rPr>
+              <w:t xml:space="preserve">[Pega aquí la captura de pantalla]</w:t>
+            </w:r>
+          </w:p>
+        </w:tc>
+      </w:tr>
+    </w:tbl>
+    <w:p>
+      <w:pPr>
+        <w:spacing w:after="160"/>
+      </w:pPr>
+    </w:p>
+    <w:p>
+      <w:pPr>
+        <w:pBdr>
+          <w:bottom w:val="single" w:color="FFA000" w:sz="4" w:space="1"/>
+        </w:pBdr>
+        <w:spacing w:after="120" w:before="240"/>
+      </w:pPr>
+      <w:r>
+        <w:rPr>
+          <w:rFonts w:ascii="Arial" w:cs="Arial" w:eastAsia="Arial" w:hAnsi="Arial"/>
+          <w:b/>
+          <w:bCs/>
+          <w:color w:val="3949AB"/>
+          <w:sz w:val="24"/>
+          <w:szCs w:val="24"/>
+        </w:rPr>
+        <w:t xml:space="preserve">Explica los dos fallos</w:t>
+      </w:r>
+    </w:p>
+    <w:p>
+      <w:pPr>
+        <w:spacing w:after="100"/>
+      </w:pPr>
+      <w:r>
+        <w:rPr>
+          <w:rFonts w:ascii="Arial" w:cs="Arial" w:eastAsia="Arial" w:hAnsi="Arial"/>
+          <w:color w:val="212121"/>
+          <w:sz w:val="22"/>
+          <w:szCs w:val="22"/>
+        </w:rPr>
+        <w:t xml:space="preserve">Para cada uno de los dos casos: ¿cuál de las tres capas ha fallado, y por qué las otras dos no se han visto afectadas?</w:t>
+      </w:r>
+    </w:p>
+    <w:tbl>
+      <w:tblPr>
+        <w:tblW w:type="dxa" w:w="9638"/>
+        <w:tblBorders>
+          <w:top w:val="single" w:color="auto" w:sz="4"/>
+          <w:left w:val="single" w:color="auto" w:sz="4"/>
+          <w:bottom w:val="single" w:color="auto" w:sz="4"/>
+          <w:right w:val="single" w:color="auto" w:sz="4"/>
+          <w:insideH w:val="single" w:color="auto" w:sz="4"/>
+          <w:insideV w:val="single" w:color="auto" w:sz="4"/>
+        </w:tblBorders>
+      </w:tblPr>
+      <w:tblGrid>
+        <w:gridCol w:w="9638"/>
+      </w:tblGrid>
       <w:tr>
         <w:trPr>
           <w:trHeight w:val="480"/>

</xml_diff>